<commit_message>
Quitar el resumen final de la propuesta de Talitacumdancecol.
El cierre queda con las firmas y los contactos alineados en la última página.

Co-authored-by: Jhon123Javier <Jhon123Javier@users.noreply.github.com>
</commit_message>
<xml_diff>
--- a/documentos/talitacumdacecol/Propuesta The Company Dev - Talitacumdancecol - Sitio Web y Redes.docx
+++ b/documentos/talitacumdacecol/Propuesta The Company Dev - Talitacumdancecol - Sitio Web y Redes.docx
@@ -3486,6 +3486,22 @@
     </w:p>
     <w:p>
       <w:pPr>
+        <w:spacing w:before="0" w:after="0" w:line="259" w:lineRule="auto"/>
+        <w:jc w:val="left"/>
+        <w:widowControl/>
+      </w:pPr>
+      <w:r>
+        <w:rPr>
+          <w:rFonts w:ascii="Poppins" w:hAnsi="Poppins" w:cs="Poppins" w:eastAsia="Poppins"/>
+          <w:b w:val="0"/>
+          <w:i w:val="0"/>
+          <w:sz w:val="2"/>
+        </w:rPr>
+        <w:br w:type="page"/>
+      </w:r>
+    </w:p>
+    <w:p>
+      <w:pPr>
         <w:spacing w:before="240" w:after="80" w:line="259" w:lineRule="auto"/>
         <w:jc w:val="left"/>
         <w:keepNext/>
@@ -3771,8 +3787,9 @@
     </w:p>
     <w:tbl>
       <w:tblPr>
-        <w:tblW w:type="auto" w:w="0"/>
-        <w:tblLayout w:type="autofit"/>
+        <w:tblW w:type="dxa" w:w="9648"/>
+        <w:jc w:val="center"/>
+        <w:tblLayout w:type="fixed"/>
         <w:tblLook w:firstColumn="1" w:firstRow="1" w:lastColumn="0" w:lastRow="0" w:noHBand="0" w:noVBand="1" w:val="04A0"/>
       </w:tblPr>
       <w:tblGrid>
@@ -3792,7 +3809,7 @@
           </w:tcPr>
           <w:p>
             <w:pPr>
-              <w:spacing w:before="360" w:after="0" w:line="259" w:lineRule="auto"/>
+              <w:spacing w:before="440" w:after="0" w:line="259" w:lineRule="auto"/>
               <w:jc w:val="left"/>
               <w:widowControl/>
             </w:pPr>
@@ -3855,7 +3872,7 @@
           </w:tcPr>
           <w:p>
             <w:pPr>
-              <w:spacing w:before="360" w:after="0" w:line="259" w:lineRule="auto"/>
+              <w:spacing w:before="440" w:after="0" w:line="259" w:lineRule="auto"/>
               <w:jc w:val="left"/>
               <w:widowControl/>
             </w:pPr>
@@ -3893,492 +3910,7 @@
     </w:tbl>
     <w:p>
       <w:pPr>
-        <w:spacing w:before="1560" w:after="0" w:line="259" w:lineRule="auto"/>
-        <w:jc w:val="left"/>
-        <w:widowControl/>
-      </w:pPr>
-    </w:p>
-    <w:p>
-      <w:pPr>
-        <w:spacing w:before="240" w:after="80" w:line="259" w:lineRule="auto"/>
-        <w:jc w:val="left"/>
-        <w:keepNext/>
-        <w:widowControl/>
-      </w:pPr>
-      <w:r>
-        <w:rPr>
-          <w:rFonts w:ascii="Poppins" w:hAnsi="Poppins" w:cs="Poppins" w:eastAsia="Poppins"/>
-          <w:b/>
-          <w:i w:val="0"/>
-          <w:color w:val="1B3325"/>
-          <w:sz w:val="26"/>
-        </w:rPr>
-        <w:t>8. Resumen de inversión</w:t>
-      </w:r>
-    </w:p>
-    <w:p>
-      <w:pPr>
-        <w:spacing w:before="0" w:after="80" w:line="259" w:lineRule="auto"/>
-        <w:jc w:val="both"/>
-        <w:keepNext/>
-        <w:widowControl/>
-      </w:pPr>
-      <w:r>
-        <w:rPr>
-          <w:rFonts w:ascii="Poppins" w:hAnsi="Poppins" w:cs="Poppins" w:eastAsia="Poppins"/>
-          <w:b w:val="0"/>
-          <w:i w:val="0"/>
-          <w:color w:val="1B3325"/>
-          <w:sz w:val="26"/>
-        </w:rPr>
-        <w:t>Estos son los valores de la propuesta, reunidos al cierre:</w:t>
-      </w:r>
-    </w:p>
-    <w:tbl>
-      <w:tblPr>
-        <w:tblW w:type="dxa" w:w="9648"/>
-        <w:jc w:val="center"/>
-        <w:tblLayout w:type="fixed"/>
-        <w:tblLook w:firstColumn="1" w:firstRow="1" w:lastColumn="0" w:lastRow="0" w:noHBand="0" w:noVBand="1" w:val="04A0"/>
-      </w:tblPr>
-      <w:tblGrid>
-        <w:gridCol w:w="5600"/>
-        <w:gridCol w:w="4048"/>
-      </w:tblGrid>
-      <w:tr>
-        <w:trPr>
-          <w:cantSplit/>
-        </w:trPr>
-        <w:tc>
-          <w:tcPr>
-            <w:tcW w:type="dxa" w:w="5600"/>
-            <w:tcBorders>
-              <w:top w:val="single" w:sz="4" w:space="0" w:color="1B3325"/>
-              <w:left w:val="single" w:sz="4" w:space="0" w:color="1B3325"/>
-              <w:bottom w:val="single" w:sz="4" w:space="0" w:color="1B3325"/>
-              <w:right w:val="single" w:sz="4" w:space="0" w:color="1B3325"/>
-            </w:tcBorders>
-            <w:tcMar>
-              <w:top w:w="40" w:type="dxa"/>
-              <w:left w:w="80" w:type="dxa"/>
-              <w:bottom w:w="40" w:type="dxa"/>
-              <w:right w:w="80" w:type="dxa"/>
-            </w:tcMar>
-            <w:shd w:val="clear" w:color="auto" w:fill="1B3325"/>
-            <w:vAlign w:val="center"/>
-          </w:tcPr>
-          <w:p>
-            <w:pPr>
-              <w:spacing w:before="0" w:after="0" w:line="259" w:lineRule="auto"/>
-              <w:jc w:val="center"/>
-              <w:widowControl/>
-              <w:keepNext/>
-            </w:pPr>
-            <w:r/>
-            <w:r>
-              <w:rPr>
-                <w:rFonts w:ascii="Poppins" w:hAnsi="Poppins" w:cs="Poppins" w:eastAsia="Poppins"/>
-                <w:b/>
-                <w:i w:val="0"/>
-                <w:color w:val="FFFFFF"/>
-                <w:sz w:val="24"/>
-              </w:rPr>
-              <w:t>CONCEPTO</w:t>
-            </w:r>
-          </w:p>
-        </w:tc>
-        <w:tc>
-          <w:tcPr>
-            <w:tcW w:type="dxa" w:w="4048"/>
-            <w:tcBorders>
-              <w:top w:val="single" w:sz="4" w:space="0" w:color="1B3325"/>
-              <w:left w:val="single" w:sz="4" w:space="0" w:color="1B3325"/>
-              <w:bottom w:val="single" w:sz="4" w:space="0" w:color="1B3325"/>
-              <w:right w:val="single" w:sz="4" w:space="0" w:color="1B3325"/>
-            </w:tcBorders>
-            <w:tcMar>
-              <w:top w:w="40" w:type="dxa"/>
-              <w:left w:w="80" w:type="dxa"/>
-              <w:bottom w:w="40" w:type="dxa"/>
-              <w:right w:w="80" w:type="dxa"/>
-            </w:tcMar>
-            <w:shd w:val="clear" w:color="auto" w:fill="1B3325"/>
-            <w:vAlign w:val="center"/>
-          </w:tcPr>
-          <w:p>
-            <w:pPr>
-              <w:spacing w:before="0" w:after="0" w:line="259" w:lineRule="auto"/>
-              <w:jc w:val="center"/>
-              <w:widowControl/>
-              <w:keepNext/>
-            </w:pPr>
-            <w:r/>
-            <w:r>
-              <w:rPr>
-                <w:rFonts w:ascii="Poppins" w:hAnsi="Poppins" w:cs="Poppins" w:eastAsia="Poppins"/>
-                <w:b/>
-                <w:i w:val="0"/>
-                <w:color w:val="FFFFFF"/>
-                <w:sz w:val="24"/>
-              </w:rPr>
-              <w:t>VALOR</w:t>
-            </w:r>
-          </w:p>
-        </w:tc>
-      </w:tr>
-      <w:tr>
-        <w:trPr>
-          <w:cantSplit/>
-        </w:trPr>
-        <w:tc>
-          <w:tcPr>
-            <w:tcW w:type="dxa" w:w="5600"/>
-            <w:tcBorders>
-              <w:top w:val="single" w:sz="4" w:space="0" w:color="1B3325"/>
-              <w:left w:val="single" w:sz="4" w:space="0" w:color="1B3325"/>
-              <w:bottom w:val="single" w:sz="4" w:space="0" w:color="1B3325"/>
-              <w:right w:val="single" w:sz="4" w:space="0" w:color="1B3325"/>
-            </w:tcBorders>
-            <w:tcMar>
-              <w:top w:w="40" w:type="dxa"/>
-              <w:left w:w="80" w:type="dxa"/>
-              <w:bottom w:w="40" w:type="dxa"/>
-              <w:right w:w="80" w:type="dxa"/>
-            </w:tcMar>
-            <w:shd w:val="clear" w:color="auto" w:fill="FFFFFF"/>
-            <w:vAlign w:val="center"/>
-          </w:tcPr>
-          <w:p>
-            <w:pPr>
-              <w:spacing w:before="0" w:after="0" w:line="259" w:lineRule="auto"/>
-              <w:jc w:val="left"/>
-              <w:widowControl/>
-              <w:keepNext/>
-            </w:pPr>
-            <w:r/>
-            <w:r>
-              <w:rPr>
-                <w:rFonts w:ascii="Poppins" w:hAnsi="Poppins" w:cs="Poppins" w:eastAsia="Poppins"/>
-                <w:b w:val="0"/>
-                <w:i w:val="0"/>
-                <w:color w:val="1B3325"/>
-                <w:sz w:val="24"/>
-              </w:rPr>
-              <w:t>Sitio web corporativo</w:t>
-            </w:r>
-          </w:p>
-        </w:tc>
-        <w:tc>
-          <w:tcPr>
-            <w:tcW w:type="dxa" w:w="4048"/>
-            <w:tcBorders>
-              <w:top w:val="single" w:sz="4" w:space="0" w:color="1B3325"/>
-              <w:left w:val="single" w:sz="4" w:space="0" w:color="1B3325"/>
-              <w:bottom w:val="single" w:sz="4" w:space="0" w:color="1B3325"/>
-              <w:right w:val="single" w:sz="4" w:space="0" w:color="1B3325"/>
-            </w:tcBorders>
-            <w:tcMar>
-              <w:top w:w="40" w:type="dxa"/>
-              <w:left w:w="80" w:type="dxa"/>
-              <w:bottom w:w="40" w:type="dxa"/>
-              <w:right w:w="80" w:type="dxa"/>
-            </w:tcMar>
-            <w:shd w:val="clear" w:color="auto" w:fill="FFFF00"/>
-            <w:vAlign w:val="center"/>
-          </w:tcPr>
-          <w:p>
-            <w:pPr>
-              <w:spacing w:before="0" w:after="0" w:line="259" w:lineRule="auto"/>
-              <w:jc w:val="right"/>
-              <w:widowControl/>
-              <w:keepNext/>
-            </w:pPr>
-            <w:r>
-              <w:rPr>
-                <w:highlight w:val="yellow"/>
-              </w:rPr>
-            </w:r>
-            <w:r>
-              <w:rPr>
-                <w:rFonts w:ascii="Poppins" w:hAnsi="Poppins" w:cs="Poppins" w:eastAsia="Poppins"/>
-                <w:b/>
-                <w:i w:val="0"/>
-                <w:color w:val="1B3325"/>
-                <w:sz w:val="24"/>
-                <w:highlight w:val="yellow"/>
-              </w:rPr>
-              <w:t>$800.000 COP</w:t>
-            </w:r>
-          </w:p>
-        </w:tc>
-      </w:tr>
-      <w:tr>
-        <w:trPr>
-          <w:cantSplit/>
-        </w:trPr>
-        <w:tc>
-          <w:tcPr>
-            <w:tcW w:type="dxa" w:w="5600"/>
-            <w:tcBorders>
-              <w:top w:val="single" w:sz="4" w:space="0" w:color="1B3325"/>
-              <w:left w:val="single" w:sz="4" w:space="0" w:color="1B3325"/>
-              <w:bottom w:val="single" w:sz="4" w:space="0" w:color="1B3325"/>
-              <w:right w:val="single" w:sz="4" w:space="0" w:color="1B3325"/>
-            </w:tcBorders>
-            <w:tcMar>
-              <w:top w:w="40" w:type="dxa"/>
-              <w:left w:w="80" w:type="dxa"/>
-              <w:bottom w:w="40" w:type="dxa"/>
-              <w:right w:w="80" w:type="dxa"/>
-            </w:tcMar>
-            <w:shd w:val="clear" w:color="auto" w:fill="FFFFFF"/>
-            <w:vAlign w:val="center"/>
-          </w:tcPr>
-          <w:p>
-            <w:pPr>
-              <w:spacing w:before="0" w:after="0" w:line="259" w:lineRule="auto"/>
-              <w:jc w:val="left"/>
-              <w:widowControl/>
-              <w:keepNext/>
-            </w:pPr>
-            <w:r/>
-            <w:r>
-              <w:rPr>
-                <w:rFonts w:ascii="Poppins" w:hAnsi="Poppins" w:cs="Poppins" w:eastAsia="Poppins"/>
-                <w:b w:val="0"/>
-                <w:i w:val="0"/>
-                <w:color w:val="1B3325"/>
-                <w:sz w:val="24"/>
-              </w:rPr>
-              <w:t>Plan de redes sociales</w:t>
-            </w:r>
-          </w:p>
-        </w:tc>
-        <w:tc>
-          <w:tcPr>
-            <w:tcW w:type="dxa" w:w="4048"/>
-            <w:tcBorders>
-              <w:top w:val="single" w:sz="4" w:space="0" w:color="1B3325"/>
-              <w:left w:val="single" w:sz="4" w:space="0" w:color="1B3325"/>
-              <w:bottom w:val="single" w:sz="4" w:space="0" w:color="1B3325"/>
-              <w:right w:val="single" w:sz="4" w:space="0" w:color="1B3325"/>
-            </w:tcBorders>
-            <w:tcMar>
-              <w:top w:w="40" w:type="dxa"/>
-              <w:left w:w="80" w:type="dxa"/>
-              <w:bottom w:w="40" w:type="dxa"/>
-              <w:right w:w="80" w:type="dxa"/>
-            </w:tcMar>
-            <w:shd w:val="clear" w:color="auto" w:fill="FFFF00"/>
-            <w:vAlign w:val="center"/>
-          </w:tcPr>
-          <w:p>
-            <w:pPr>
-              <w:spacing w:before="0" w:after="0" w:line="259" w:lineRule="auto"/>
-              <w:jc w:val="right"/>
-              <w:widowControl/>
-              <w:keepNext/>
-            </w:pPr>
-            <w:r>
-              <w:rPr>
-                <w:highlight w:val="yellow"/>
-              </w:rPr>
-            </w:r>
-            <w:r>
-              <w:rPr>
-                <w:rFonts w:ascii="Poppins" w:hAnsi="Poppins" w:cs="Poppins" w:eastAsia="Poppins"/>
-                <w:b/>
-                <w:i w:val="0"/>
-                <w:color w:val="1B3325"/>
-                <w:sz w:val="24"/>
-                <w:highlight w:val="yellow"/>
-              </w:rPr>
-              <w:t>$1.000.000 COP al mes</w:t>
-            </w:r>
-          </w:p>
-        </w:tc>
-      </w:tr>
-      <w:tr>
-        <w:trPr>
-          <w:cantSplit/>
-        </w:trPr>
-        <w:tc>
-          <w:tcPr>
-            <w:tcW w:type="dxa" w:w="5600"/>
-            <w:tcBorders>
-              <w:top w:val="single" w:sz="4" w:space="0" w:color="1B3325"/>
-              <w:left w:val="single" w:sz="4" w:space="0" w:color="1B3325"/>
-              <w:bottom w:val="single" w:sz="4" w:space="0" w:color="1B3325"/>
-              <w:right w:val="single" w:sz="4" w:space="0" w:color="1B3325"/>
-            </w:tcBorders>
-            <w:tcMar>
-              <w:top w:w="40" w:type="dxa"/>
-              <w:left w:w="80" w:type="dxa"/>
-              <w:bottom w:w="40" w:type="dxa"/>
-              <w:right w:w="80" w:type="dxa"/>
-            </w:tcMar>
-            <w:shd w:val="clear" w:color="auto" w:fill="FFFFFF"/>
-            <w:vAlign w:val="center"/>
-          </w:tcPr>
-          <w:p>
-            <w:pPr>
-              <w:spacing w:before="0" w:after="0" w:line="259" w:lineRule="auto"/>
-              <w:jc w:val="left"/>
-              <w:widowControl/>
-              <w:keepNext/>
-            </w:pPr>
-            <w:r/>
-            <w:r>
-              <w:rPr>
-                <w:rFonts w:ascii="Poppins" w:hAnsi="Poppins" w:cs="Poppins" w:eastAsia="Poppins"/>
-                <w:b w:val="0"/>
-                <w:i w:val="0"/>
-                <w:color w:val="1B3325"/>
-                <w:sz w:val="24"/>
-              </w:rPr>
-              <w:t>Consultoría y asesoría de campaña</w:t>
-            </w:r>
-          </w:p>
-        </w:tc>
-        <w:tc>
-          <w:tcPr>
-            <w:tcW w:type="dxa" w:w="4048"/>
-            <w:tcBorders>
-              <w:top w:val="single" w:sz="4" w:space="0" w:color="1B3325"/>
-              <w:left w:val="single" w:sz="4" w:space="0" w:color="1B3325"/>
-              <w:bottom w:val="single" w:sz="4" w:space="0" w:color="1B3325"/>
-              <w:right w:val="single" w:sz="4" w:space="0" w:color="1B3325"/>
-            </w:tcBorders>
-            <w:tcMar>
-              <w:top w:w="40" w:type="dxa"/>
-              <w:left w:w="80" w:type="dxa"/>
-              <w:bottom w:w="40" w:type="dxa"/>
-              <w:right w:w="80" w:type="dxa"/>
-            </w:tcMar>
-            <w:shd w:val="clear" w:color="auto" w:fill="FFFF00"/>
-            <w:vAlign w:val="center"/>
-          </w:tcPr>
-          <w:p>
-            <w:pPr>
-              <w:spacing w:before="0" w:after="0" w:line="259" w:lineRule="auto"/>
-              <w:jc w:val="right"/>
-              <w:widowControl/>
-              <w:keepNext/>
-            </w:pPr>
-            <w:r>
-              <w:rPr>
-                <w:highlight w:val="yellow"/>
-              </w:rPr>
-            </w:r>
-            <w:r>
-              <w:rPr>
-                <w:rFonts w:ascii="Poppins" w:hAnsi="Poppins" w:cs="Poppins" w:eastAsia="Poppins"/>
-                <w:b/>
-                <w:i w:val="0"/>
-                <w:color w:val="1B3325"/>
-                <w:sz w:val="24"/>
-                <w:highlight w:val="yellow"/>
-              </w:rPr>
-              <w:t>$50.000 COP por campaña</w:t>
-            </w:r>
-          </w:p>
-        </w:tc>
-      </w:tr>
-      <w:tr>
-        <w:trPr>
-          <w:cantSplit/>
-        </w:trPr>
-        <w:tc>
-          <w:tcPr>
-            <w:tcW w:type="dxa" w:w="5600"/>
-            <w:tcBorders>
-              <w:top w:val="single" w:sz="4" w:space="0" w:color="1B3325"/>
-              <w:left w:val="single" w:sz="4" w:space="0" w:color="1B3325"/>
-              <w:bottom w:val="single" w:sz="4" w:space="0" w:color="1B3325"/>
-              <w:right w:val="single" w:sz="4" w:space="0" w:color="1B3325"/>
-            </w:tcBorders>
-            <w:tcMar>
-              <w:top w:w="40" w:type="dxa"/>
-              <w:left w:w="80" w:type="dxa"/>
-              <w:bottom w:w="40" w:type="dxa"/>
-              <w:right w:w="80" w:type="dxa"/>
-            </w:tcMar>
-            <w:shd w:val="clear" w:color="auto" w:fill="FFFFFF"/>
-            <w:vAlign w:val="center"/>
-          </w:tcPr>
-          <w:p>
-            <w:pPr>
-              <w:spacing w:before="0" w:after="0" w:line="259" w:lineRule="auto"/>
-              <w:jc w:val="left"/>
-              <w:widowControl/>
-            </w:pPr>
-            <w:r/>
-            <w:r>
-              <w:rPr>
-                <w:rFonts w:ascii="Poppins" w:hAnsi="Poppins" w:cs="Poppins" w:eastAsia="Poppins"/>
-                <w:b w:val="0"/>
-                <w:i w:val="0"/>
-                <w:color w:val="1B3325"/>
-                <w:sz w:val="24"/>
-              </w:rPr>
-              <w:t>Realización de cada campaña</w:t>
-            </w:r>
-          </w:p>
-        </w:tc>
-        <w:tc>
-          <w:tcPr>
-            <w:tcW w:type="dxa" w:w="4048"/>
-            <w:tcBorders>
-              <w:top w:val="single" w:sz="4" w:space="0" w:color="1B3325"/>
-              <w:left w:val="single" w:sz="4" w:space="0" w:color="1B3325"/>
-              <w:bottom w:val="single" w:sz="4" w:space="0" w:color="1B3325"/>
-              <w:right w:val="single" w:sz="4" w:space="0" w:color="1B3325"/>
-            </w:tcBorders>
-            <w:tcMar>
-              <w:top w:w="40" w:type="dxa"/>
-              <w:left w:w="80" w:type="dxa"/>
-              <w:bottom w:w="40" w:type="dxa"/>
-              <w:right w:w="80" w:type="dxa"/>
-            </w:tcMar>
-            <w:shd w:val="clear" w:color="auto" w:fill="FFFF00"/>
-            <w:vAlign w:val="center"/>
-          </w:tcPr>
-          <w:p>
-            <w:pPr>
-              <w:spacing w:before="0" w:after="0" w:line="259" w:lineRule="auto"/>
-              <w:jc w:val="right"/>
-              <w:widowControl/>
-            </w:pPr>
-            <w:r>
-              <w:rPr>
-                <w:highlight w:val="yellow"/>
-              </w:rPr>
-            </w:r>
-            <w:r>
-              <w:rPr>
-                <w:rFonts w:ascii="Poppins" w:hAnsi="Poppins" w:cs="Poppins" w:eastAsia="Poppins"/>
-                <w:b/>
-                <w:i w:val="0"/>
-                <w:color w:val="1B3325"/>
-                <w:sz w:val="24"/>
-                <w:highlight w:val="yellow"/>
-              </w:rPr>
-              <w:t>$120.000 COP cada una</w:t>
-            </w:r>
-          </w:p>
-        </w:tc>
-      </w:tr>
-    </w:tbl>
-    <w:p>
-      <w:pPr>
-        <w:spacing w:before="40" w:after="40" w:line="259" w:lineRule="auto"/>
-        <w:jc w:val="left"/>
-        <w:widowControl/>
-      </w:pPr>
-    </w:p>
-    <w:p>
-      <w:pPr>
-        <w:spacing w:before="160" w:after="0" w:line="259" w:lineRule="auto"/>
+        <w:spacing w:before="1800" w:after="0" w:line="259" w:lineRule="auto"/>
         <w:jc w:val="left"/>
         <w:widowControl/>
       </w:pPr>

</xml_diff>